<commit_message>
basic bivariate dummies loop
</commit_message>
<xml_diff>
--- a/items template.docx
+++ b/items template.docx
@@ -4841,6 +4841,296 @@
           <w:color w:val="000000" w:themeColor="text1"/>
         </w:rPr>
         <w:t>A few times a month</w:t>
+      </w:r>
+    </w:p>
+    <w:p>
+      <w:pPr>
+        <w:rPr>
+          <w:rFonts w:ascii="Times New Roman" w:hAnsi="Times New Roman" w:cs="Times New Roman"/>
+          <w:color w:val="000000" w:themeColor="text1"/>
+        </w:rPr>
+      </w:pPr>
+    </w:p>
+    <w:p>
+      <w:pPr>
+        <w:rPr>
+          <w:rFonts w:ascii="Times New Roman" w:hAnsi="Times New Roman" w:cs="Times New Roman"/>
+          <w:color w:val="000000" w:themeColor="text1"/>
+        </w:rPr>
+      </w:pPr>
+    </w:p>
+    <w:p>
+      <w:pPr>
+        <w:rPr>
+          <w:rFonts w:ascii="Times New Roman" w:hAnsi="Times New Roman" w:cs="Times New Roman"/>
+          <w:color w:val="000000" w:themeColor="text1"/>
+        </w:rPr>
+      </w:pPr>
+      <w:r>
+        <w:rPr>
+          <w:rFonts w:ascii="Times New Roman" w:hAnsi="Times New Roman" w:cs="Times New Roman"/>
+          <w:color w:val="000000" w:themeColor="text1"/>
+        </w:rPr>
+        <w:t>001011</w:t>
+      </w:r>
+    </w:p>
+    <w:p>
+      <w:pPr>
+        <w:rPr>
+          <w:rFonts w:ascii="Times New Roman" w:hAnsi="Times New Roman" w:cs="Times New Roman"/>
+          <w:color w:val="000000" w:themeColor="text1"/>
+        </w:rPr>
+      </w:pPr>
+      <w:r>
+        <w:rPr>
+          <w:rFonts w:ascii="Times New Roman" w:hAnsi="Times New Roman" w:cs="Times New Roman"/>
+          <w:color w:val="000000" w:themeColor="text1"/>
+        </w:rPr>
+        <w:t>011001</w:t>
+      </w:r>
+    </w:p>
+    <w:p>
+      <w:pPr>
+        <w:rPr>
+          <w:rFonts w:ascii="Times New Roman" w:hAnsi="Times New Roman" w:cs="Times New Roman"/>
+          <w:color w:val="000000" w:themeColor="text1"/>
+        </w:rPr>
+      </w:pPr>
+      <w:r>
+        <w:rPr>
+          <w:rFonts w:ascii="Times New Roman" w:hAnsi="Times New Roman" w:cs="Times New Roman"/>
+          <w:color w:val="000000" w:themeColor="text1"/>
+        </w:rPr>
+        <w:t>all Nas</w:t>
+      </w:r>
+    </w:p>
+    <w:p>
+      <w:pPr>
+        <w:rPr>
+          <w:rFonts w:ascii="Times New Roman" w:hAnsi="Times New Roman" w:cs="Times New Roman"/>
+          <w:color w:val="000000" w:themeColor="text1"/>
+        </w:rPr>
+      </w:pPr>
+      <w:r>
+        <w:rPr>
+          <w:rFonts w:ascii="Times New Roman" w:hAnsi="Times New Roman" w:cs="Times New Roman"/>
+          <w:color w:val="000000" w:themeColor="text1"/>
+        </w:rPr>
+        <w:t>010011</w:t>
+      </w:r>
+    </w:p>
+    <w:p>
+      <w:pPr>
+        <w:rPr>
+          <w:rFonts w:ascii="Times New Roman" w:hAnsi="Times New Roman" w:cs="Times New Roman"/>
+          <w:color w:val="000000" w:themeColor="text1"/>
+        </w:rPr>
+      </w:pPr>
+      <w:r>
+        <w:rPr>
+          <w:rFonts w:ascii="Times New Roman" w:hAnsi="Times New Roman" w:cs="Times New Roman"/>
+          <w:color w:val="000000" w:themeColor="text1"/>
+        </w:rPr>
+        <w:t xml:space="preserve">NA </w:t>
+      </w:r>
+      <w:proofErr w:type="spellStart"/>
+      <w:r>
+        <w:rPr>
+          <w:rFonts w:ascii="Times New Roman" w:hAnsi="Times New Roman" w:cs="Times New Roman"/>
+          <w:color w:val="000000" w:themeColor="text1"/>
+        </w:rPr>
+        <w:t>NA</w:t>
+      </w:r>
+      <w:proofErr w:type="spellEnd"/>
+      <w:r>
+        <w:rPr>
+          <w:rFonts w:ascii="Times New Roman" w:hAnsi="Times New Roman" w:cs="Times New Roman"/>
+          <w:color w:val="000000" w:themeColor="text1"/>
+        </w:rPr>
+        <w:t xml:space="preserve"> </w:t>
+      </w:r>
+      <w:proofErr w:type="spellStart"/>
+      <w:r>
+        <w:rPr>
+          <w:rFonts w:ascii="Times New Roman" w:hAnsi="Times New Roman" w:cs="Times New Roman"/>
+          <w:color w:val="000000" w:themeColor="text1"/>
+        </w:rPr>
+        <w:t>NA</w:t>
+      </w:r>
+      <w:proofErr w:type="spellEnd"/>
+      <w:r>
+        <w:rPr>
+          <w:rFonts w:ascii="Times New Roman" w:hAnsi="Times New Roman" w:cs="Times New Roman"/>
+          <w:color w:val="000000" w:themeColor="text1"/>
+        </w:rPr>
+        <w:t xml:space="preserve"> knows victim</w:t>
+      </w:r>
+    </w:p>
+    <w:p>
+      <w:pPr>
+        <w:rPr>
+          <w:rFonts w:ascii="Times New Roman" w:hAnsi="Times New Roman" w:cs="Times New Roman"/>
+          <w:color w:val="000000" w:themeColor="text1"/>
+        </w:rPr>
+      </w:pPr>
+      <w:r>
+        <w:rPr>
+          <w:rFonts w:ascii="Times New Roman" w:hAnsi="Times New Roman" w:cs="Times New Roman"/>
+          <w:color w:val="000000" w:themeColor="text1"/>
+        </w:rPr>
+        <w:t>001111</w:t>
+      </w:r>
+    </w:p>
+    <w:p>
+      <w:pPr>
+        <w:rPr>
+          <w:rFonts w:ascii="Times New Roman" w:hAnsi="Times New Roman" w:cs="Times New Roman"/>
+          <w:color w:val="000000" w:themeColor="text1"/>
+        </w:rPr>
+      </w:pPr>
+      <w:r>
+        <w:rPr>
+          <w:rFonts w:ascii="Times New Roman" w:hAnsi="Times New Roman" w:cs="Times New Roman"/>
+          <w:color w:val="000000" w:themeColor="text1"/>
+        </w:rPr>
+        <w:t>011110</w:t>
+      </w:r>
+    </w:p>
+    <w:p>
+      <w:pPr>
+        <w:rPr>
+          <w:rFonts w:ascii="Times New Roman" w:hAnsi="Times New Roman" w:cs="Times New Roman"/>
+          <w:color w:val="000000" w:themeColor="text1"/>
+        </w:rPr>
+      </w:pPr>
+      <w:r>
+        <w:rPr>
+          <w:rFonts w:ascii="Times New Roman" w:hAnsi="Times New Roman" w:cs="Times New Roman"/>
+          <w:color w:val="000000" w:themeColor="text1"/>
+        </w:rPr>
+        <w:t>Nas then 001</w:t>
+      </w:r>
+    </w:p>
+    <w:p>
+      <w:pPr>
+        <w:rPr>
+          <w:rFonts w:ascii="Times New Roman" w:hAnsi="Times New Roman" w:cs="Times New Roman"/>
+          <w:color w:val="000000" w:themeColor="text1"/>
+        </w:rPr>
+      </w:pPr>
+      <w:r>
+        <w:rPr>
+          <w:rFonts w:ascii="Times New Roman" w:hAnsi="Times New Roman" w:cs="Times New Roman"/>
+          <w:color w:val="000000" w:themeColor="text1"/>
+        </w:rPr>
+        <w:t xml:space="preserve">NA </w:t>
+      </w:r>
+      <w:proofErr w:type="spellStart"/>
+      <w:r>
+        <w:rPr>
+          <w:rFonts w:ascii="Times New Roman" w:hAnsi="Times New Roman" w:cs="Times New Roman"/>
+          <w:color w:val="000000" w:themeColor="text1"/>
+        </w:rPr>
+        <w:t>NA</w:t>
+      </w:r>
+      <w:proofErr w:type="spellEnd"/>
+      <w:r>
+        <w:rPr>
+          <w:rFonts w:ascii="Times New Roman" w:hAnsi="Times New Roman" w:cs="Times New Roman"/>
+          <w:color w:val="000000" w:themeColor="text1"/>
+        </w:rPr>
+        <w:t xml:space="preserve"> </w:t>
+      </w:r>
+      <w:proofErr w:type="spellStart"/>
+      <w:r>
+        <w:rPr>
+          <w:rFonts w:ascii="Times New Roman" w:hAnsi="Times New Roman" w:cs="Times New Roman"/>
+          <w:color w:val="000000" w:themeColor="text1"/>
+        </w:rPr>
+        <w:t>NA</w:t>
+      </w:r>
+      <w:proofErr w:type="spellEnd"/>
+      <w:r>
+        <w:rPr>
+          <w:rFonts w:ascii="Times New Roman" w:hAnsi="Times New Roman" w:cs="Times New Roman"/>
+          <w:color w:val="000000" w:themeColor="text1"/>
+        </w:rPr>
+        <w:t xml:space="preserve"> then 100</w:t>
+      </w:r>
+    </w:p>
+    <w:p>
+      <w:pPr>
+        <w:rPr>
+          <w:rFonts w:ascii="Times New Roman" w:hAnsi="Times New Roman" w:cs="Times New Roman"/>
+          <w:color w:val="000000" w:themeColor="text1"/>
+        </w:rPr>
+      </w:pPr>
+      <w:r>
+        <w:rPr>
+          <w:rFonts w:ascii="Times New Roman" w:hAnsi="Times New Roman" w:cs="Times New Roman"/>
+          <w:color w:val="000000" w:themeColor="text1"/>
+        </w:rPr>
+        <w:t>001-99-99-99</w:t>
+      </w:r>
+    </w:p>
+    <w:p>
+      <w:pPr>
+        <w:rPr>
+          <w:rFonts w:ascii="Times New Roman" w:hAnsi="Times New Roman" w:cs="Times New Roman"/>
+          <w:color w:val="000000" w:themeColor="text1"/>
+        </w:rPr>
+      </w:pPr>
+      <w:r>
+        <w:rPr>
+          <w:rFonts w:ascii="Times New Roman" w:hAnsi="Times New Roman" w:cs="Times New Roman"/>
+          <w:color w:val="000000" w:themeColor="text1"/>
+        </w:rPr>
+        <w:t>011010</w:t>
+      </w:r>
+    </w:p>
+    <w:p>
+      <w:pPr>
+        <w:rPr>
+          <w:rFonts w:ascii="Times New Roman" w:hAnsi="Times New Roman" w:cs="Times New Roman"/>
+          <w:color w:val="000000" w:themeColor="text1"/>
+        </w:rPr>
+      </w:pPr>
+      <w:r>
+        <w:rPr>
+          <w:rFonts w:ascii="Times New Roman" w:hAnsi="Times New Roman" w:cs="Times New Roman"/>
+          <w:color w:val="000000" w:themeColor="text1"/>
+        </w:rPr>
+        <w:t>100-99-99-99</w:t>
+      </w:r>
+    </w:p>
+    <w:p>
+      <w:pPr>
+        <w:rPr>
+          <w:rFonts w:ascii="Times New Roman" w:hAnsi="Times New Roman" w:cs="Times New Roman"/>
+          <w:color w:val="000000" w:themeColor="text1"/>
+        </w:rPr>
+      </w:pPr>
+      <w:r>
+        <w:rPr>
+          <w:rFonts w:ascii="Times New Roman" w:hAnsi="Times New Roman" w:cs="Times New Roman"/>
+          <w:color w:val="000000" w:themeColor="text1"/>
+        </w:rPr>
+        <w:t>110101</w:t>
+      </w:r>
+    </w:p>
+    <w:p>
+      <w:pPr>
+        <w:rPr>
+          <w:rFonts w:ascii="Times New Roman" w:hAnsi="Times New Roman" w:cs="Times New Roman"/>
+          <w:color w:val="000000" w:themeColor="text1"/>
+        </w:rPr>
+      </w:pPr>
+      <w:r>
+        <w:rPr>
+          <w:rFonts w:ascii="Times New Roman" w:hAnsi="Times New Roman" w:cs="Times New Roman"/>
+          <w:color w:val="000000" w:themeColor="text1"/>
+        </w:rPr>
+        <w:t>111-99-99-99</w:t>
       </w:r>
     </w:p>
     <w:p>

</xml_diff>